<commit_message>
Align STA logo header margin with merchandise table
</commit_message>
<xml_diff>
--- a/src/templates/confirmacion-pedido.docx
+++ b/src/templates/confirmacion-pedido.docx
@@ -6,8 +6,8 @@
       <w:pPr>
         <w:pStyle w:val="Textoindependiente"/>
         <w:spacing w:before="1"/>
-        <w:ind w:left="-993"/>
-        <w:jc w:val="right"/>
+        <w:ind w:left="0"/>
+        <w:jc w:val="left"/>
         <w:rPr>
           <w:rFonts w:asciiTheme="minorHAnsi" w:hAnsiTheme="minorHAnsi" w:cstheme="minorHAnsi"/>
           <w:b/>

</xml_diff>